<commit_message>
Update DOCX and PDF reports with all 8 figures embedded and hypothesis-framed error cases
</commit_message>
<xml_diff>
--- a/23MID0037_Lab08_Report.docx
+++ b/23MID0037_Lab08_Report.docx
@@ -240,7 +240,102 @@
         <w:pStyle w:val="Heading1"/>
       </w:pPr>
       <w:r>
-        <w:t>3. Regression Validation Results</w:t>
+        <w:t>3. Exploratory Data Analysis &amp; Empirical Yield Distribution</w:t>
+      </w:r>
+    </w:p>
+    <w:p>
+      <w:r>
+        <w:t>National rice yield exhibits an empirical mean of 2.083 t/ha (std: 0.941 t/ha), median of 1.940 t/ha, IQR of 1.340–2.680 t/ha, and positive skewness (0.842), reflecting high-yield intensive irrigated belts contrasting with rainfed tracts.</w:t>
+      </w:r>
+    </w:p>
+    <w:p>
+      <w:r>
+        <w:drawing>
+          <wp:inline xmlns:a="http://schemas.openxmlformats.org/drawingml/2006/main" xmlns:pic="http://schemas.openxmlformats.org/drawingml/2006/picture">
+            <wp:extent cx="5029200" cy="3017520"/>
+            <wp:docPr id="1" name="Picture 1"/>
+            <wp:cNvGraphicFramePr>
+              <a:graphicFrameLocks noChangeAspect="1"/>
+            </wp:cNvGraphicFramePr>
+            <a:graphic>
+              <a:graphicData uri="http://schemas.openxmlformats.org/drawingml/2006/picture">
+                <pic:pic>
+                  <pic:nvPicPr>
+                    <pic:cNvPr id="0" name="fig1_training_yield_distribution.png"/>
+                    <pic:cNvPicPr/>
+                  </pic:nvPicPr>
+                  <pic:blipFill>
+                    <a:blip r:embed="rId9"/>
+                    <a:stretch>
+                      <a:fillRect/>
+                    </a:stretch>
+                  </pic:blipFill>
+                  <pic:spPr>
+                    <a:xfrm>
+                      <a:off x="0" y="0"/>
+                      <a:ext cx="5029200" cy="3017520"/>
+                    </a:xfrm>
+                    <a:prstGeom prst="rect"/>
+                  </pic:spPr>
+                </pic:pic>
+              </a:graphicData>
+            </a:graphic>
+          </wp:inline>
+        </w:drawing>
+      </w:r>
+    </w:p>
+    <w:p>
+      <w:r>
+        <w:t>Figure 1: Empirical Rice Yield Distribution (t/ha) (1997–2011 Training Panel, N=12,588).</w:t>
+      </w:r>
+    </w:p>
+    <w:p>
+      <w:r>
+        <w:drawing>
+          <wp:inline xmlns:a="http://schemas.openxmlformats.org/drawingml/2006/main" xmlns:pic="http://schemas.openxmlformats.org/drawingml/2006/picture">
+            <wp:extent cx="5029200" cy="2816352"/>
+            <wp:docPr id="2" name="Picture 2"/>
+            <wp:cNvGraphicFramePr>
+              <a:graphicFrameLocks noChangeAspect="1"/>
+            </wp:cNvGraphicFramePr>
+            <a:graphic>
+              <a:graphicData uri="http://schemas.openxmlformats.org/drawingml/2006/picture">
+                <pic:pic>
+                  <pic:nvPicPr>
+                    <pic:cNvPr id="0" name="fig2_training_year_coverage.png"/>
+                    <pic:cNvPicPr/>
+                  </pic:nvPicPr>
+                  <pic:blipFill>
+                    <a:blip r:embed="rId10"/>
+                    <a:stretch>
+                      <a:fillRect/>
+                    </a:stretch>
+                  </pic:blipFill>
+                  <pic:spPr>
+                    <a:xfrm>
+                      <a:off x="0" y="0"/>
+                      <a:ext cx="5029200" cy="2816352"/>
+                    </a:xfrm>
+                    <a:prstGeom prst="rect"/>
+                  </pic:spPr>
+                </pic:pic>
+              </a:graphicData>
+            </a:graphic>
+          </wp:inline>
+        </w:drawing>
+      </w:r>
+    </w:p>
+    <w:p>
+      <w:r>
+        <w:t>Figure 2: Longitudinal Observation Count Across Indian Harvest Years (1997–2015).</w:t>
+      </w:r>
+    </w:p>
+    <w:p>
+      <w:pPr>
+        <w:pStyle w:val="Heading1"/>
+      </w:pPr>
+      <w:r>
+        <w:t>4. Regression Validation Results &amp; Extension 2 Ablation</w:t>
       </w:r>
     </w:p>
     <w:tbl>
@@ -587,11 +682,59 @@
       </w:tr>
     </w:tbl>
     <w:p>
+      <w:r>
+        <w:drawing>
+          <wp:inline xmlns:a="http://schemas.openxmlformats.org/drawingml/2006/main" xmlns:pic="http://schemas.openxmlformats.org/drawingml/2006/picture">
+            <wp:extent cx="5029200" cy="3017520"/>
+            <wp:docPr id="3" name="Picture 3"/>
+            <wp:cNvGraphicFramePr>
+              <a:graphicFrameLocks noChangeAspect="1"/>
+            </wp:cNvGraphicFramePr>
+            <a:graphic>
+              <a:graphicData uri="http://schemas.openxmlformats.org/drawingml/2006/picture">
+                <pic:pic>
+                  <pic:nvPicPr>
+                    <pic:cNvPr id="0" name="fig3_validation_model_comparison.png"/>
+                    <pic:cNvPicPr/>
+                  </pic:nvPicPr>
+                  <pic:blipFill>
+                    <a:blip r:embed="rId11"/>
+                    <a:stretch>
+                      <a:fillRect/>
+                    </a:stretch>
+                  </pic:blipFill>
+                  <pic:spPr>
+                    <a:xfrm>
+                      <a:off x="0" y="0"/>
+                      <a:ext cx="5029200" cy="3017520"/>
+                    </a:xfrm>
+                    <a:prstGeom prst="rect"/>
+                  </pic:spPr>
+                </pic:pic>
+              </a:graphicData>
+            </a:graphic>
+          </wp:inline>
+        </w:drawing>
+      </w:r>
+    </w:p>
+    <w:p>
+      <w:r>
+        <w:t>Figure 3: Empirical Validation Metric Comparison Across Predeclared Regression Candidates.</w:t>
+      </w:r>
+    </w:p>
+    <w:p>
+      <w:r>
+        <w:t>Rolling Origins Mean MAE (2009–2011): Ridge 0.4975 ± 0.0305 t/ha vs Forest 0.5135 ± 0.0354 t/ha vs Tree 0.5510 ± 0.0305 t/ha vs Median 0.7675 ± 0.0558 t/ha.</w:t>
+        <w:br/>
+        <w:t>Extension 2 Depth Ablation: Full Forest (max_depth=12) Val MAE = 0.5761 t/ha vs Constrained Forest (max_depth=6) Val MAE = 0.6636 t/ha (+0.0875 t/ha error degradation).</w:t>
+      </w:r>
+    </w:p>
+    <w:p>
       <w:pPr>
         <w:pStyle w:val="Heading1"/>
       </w:pPr>
       <w:r>
-        <w:t>4. Extension 1 Classification Validation Results (All 3 Candidates)</w:t>
+        <w:t>5. Extension 1 Classification Validation Results (All 3 Candidates)</w:t>
       </w:r>
     </w:p>
     <w:tbl>
@@ -876,11 +1019,134 @@
       </w:tr>
     </w:tbl>
     <w:p>
+      <w:r>
+        <w:drawing>
+          <wp:inline xmlns:a="http://schemas.openxmlformats.org/drawingml/2006/main" xmlns:pic="http://schemas.openxmlformats.org/drawingml/2006/picture">
+            <wp:extent cx="5029200" cy="2640330"/>
+            <wp:docPr id="4" name="Picture 4"/>
+            <wp:cNvGraphicFramePr>
+              <a:graphicFrameLocks noChangeAspect="1"/>
+            </wp:cNvGraphicFramePr>
+            <a:graphic>
+              <a:graphicData uri="http://schemas.openxmlformats.org/drawingml/2006/picture">
+                <pic:pic>
+                  <pic:nvPicPr>
+                    <pic:cNvPr id="0" name="fig6_cls_training_label_distribution.png"/>
+                    <pic:cNvPicPr/>
+                  </pic:nvPicPr>
+                  <pic:blipFill>
+                    <a:blip r:embed="rId12"/>
+                    <a:stretch>
+                      <a:fillRect/>
+                    </a:stretch>
+                  </pic:blipFill>
+                  <pic:spPr>
+                    <a:xfrm>
+                      <a:off x="0" y="0"/>
+                      <a:ext cx="5029200" cy="2640330"/>
+                    </a:xfrm>
+                    <a:prstGeom prst="rect"/>
+                  </pic:spPr>
+                </pic:pic>
+              </a:graphicData>
+            </a:graphic>
+          </wp:inline>
+        </w:drawing>
+      </w:r>
+    </w:p>
+    <w:p>
+      <w:r>
+        <w:t>Figure 6: Stratified 22-Class Crop Label Balance (Training Partition, N=1,320).</w:t>
+      </w:r>
+    </w:p>
+    <w:p>
+      <w:r>
+        <w:drawing>
+          <wp:inline xmlns:a="http://schemas.openxmlformats.org/drawingml/2006/main" xmlns:pic="http://schemas.openxmlformats.org/drawingml/2006/picture">
+            <wp:extent cx="5029200" cy="3017520"/>
+            <wp:docPr id="5" name="Picture 5"/>
+            <wp:cNvGraphicFramePr>
+              <a:graphicFrameLocks noChangeAspect="1"/>
+            </wp:cNvGraphicFramePr>
+            <a:graphic>
+              <a:graphicData uri="http://schemas.openxmlformats.org/drawingml/2006/picture">
+                <pic:pic>
+                  <pic:nvPicPr>
+                    <pic:cNvPr id="0" name="fig7_cls_soil_ph_distribution.png"/>
+                    <pic:cNvPicPr/>
+                  </pic:nvPicPr>
+                  <pic:blipFill>
+                    <a:blip r:embed="rId13"/>
+                    <a:stretch>
+                      <a:fillRect/>
+                    </a:stretch>
+                  </pic:blipFill>
+                  <pic:spPr>
+                    <a:xfrm>
+                      <a:off x="0" y="0"/>
+                      <a:ext cx="5029200" cy="3017520"/>
+                    </a:xfrm>
+                    <a:prstGeom prst="rect"/>
+                  </pic:spPr>
+                </pic:pic>
+              </a:graphicData>
+            </a:graphic>
+          </wp:inline>
+        </w:drawing>
+      </w:r>
+    </w:p>
+    <w:p>
+      <w:r>
+        <w:t>Figure 7: Soil pH Tolerance Distributions Across Distinct Crop Species.</w:t>
+      </w:r>
+    </w:p>
+    <w:p>
+      <w:r>
+        <w:drawing>
+          <wp:inline xmlns:a="http://schemas.openxmlformats.org/drawingml/2006/main" xmlns:pic="http://schemas.openxmlformats.org/drawingml/2006/picture">
+            <wp:extent cx="5029200" cy="4191000"/>
+            <wp:docPr id="6" name="Picture 6"/>
+            <wp:cNvGraphicFramePr>
+              <a:graphicFrameLocks noChangeAspect="1"/>
+            </wp:cNvGraphicFramePr>
+            <a:graphic>
+              <a:graphicData uri="http://schemas.openxmlformats.org/drawingml/2006/picture">
+                <pic:pic>
+                  <pic:nvPicPr>
+                    <pic:cNvPr id="0" name="fig8_cls_confusion_matrix.png"/>
+                    <pic:cNvPicPr/>
+                  </pic:nvPicPr>
+                  <pic:blipFill>
+                    <a:blip r:embed="rId14"/>
+                    <a:stretch>
+                      <a:fillRect/>
+                    </a:stretch>
+                  </pic:blipFill>
+                  <pic:spPr>
+                    <a:xfrm>
+                      <a:off x="0" y="0"/>
+                      <a:ext cx="5029200" cy="4191000"/>
+                    </a:xfrm>
+                    <a:prstGeom prst="rect"/>
+                  </pic:spPr>
+                </pic:pic>
+              </a:graphicData>
+            </a:graphic>
+          </wp:inline>
+        </w:drawing>
+      </w:r>
+    </w:p>
+    <w:p>
+      <w:r>
+        <w:t>Figure 8: High-Resolution Confusion Matrix of Winning Random Forest on Locked Test Partition (439/440 Correct).</w:t>
+      </w:r>
+    </w:p>
+    <w:p>
       <w:pPr>
         <w:pStyle w:val="Heading1"/>
       </w:pPr>
       <w:r>
-        <w:t>5. Locked-Test Out-of-Sample Results</w:t>
+        <w:t>6. Locked-Test Out-of-Sample Results</w:t>
       </w:r>
     </w:p>
     <w:p>
@@ -900,11 +1166,98 @@
       </w:r>
     </w:p>
     <w:p>
+      <w:r>
+        <w:drawing>
+          <wp:inline xmlns:a="http://schemas.openxmlformats.org/drawingml/2006/main" xmlns:pic="http://schemas.openxmlformats.org/drawingml/2006/picture">
+            <wp:extent cx="5029200" cy="3481754"/>
+            <wp:docPr id="7" name="Picture 7"/>
+            <wp:cNvGraphicFramePr>
+              <a:graphicFrameLocks noChangeAspect="1"/>
+            </wp:cNvGraphicFramePr>
+            <a:graphic>
+              <a:graphicData uri="http://schemas.openxmlformats.org/drawingml/2006/picture">
+                <pic:pic>
+                  <pic:nvPicPr>
+                    <pic:cNvPr id="0" name="fig4_locked_test_actual_vs_predicted.png"/>
+                    <pic:cNvPicPr/>
+                  </pic:nvPicPr>
+                  <pic:blipFill>
+                    <a:blip r:embed="rId15"/>
+                    <a:stretch>
+                      <a:fillRect/>
+                    </a:stretch>
+                  </pic:blipFill>
+                  <pic:spPr>
+                    <a:xfrm>
+                      <a:off x="0" y="0"/>
+                      <a:ext cx="5029200" cy="3481754"/>
+                    </a:xfrm>
+                    <a:prstGeom prst="rect"/>
+                  </pic:spPr>
+                </pic:pic>
+              </a:graphicData>
+            </a:graphic>
+          </wp:inline>
+        </w:drawing>
+      </w:r>
+    </w:p>
+    <w:p>
+      <w:r>
+        <w:t>Figure 4: Actual vs Predicted Rice Yield on Locked Test Set (2014–2015, N=846).</w:t>
+      </w:r>
+    </w:p>
+    <w:p>
+      <w:r>
+        <w:drawing>
+          <wp:inline xmlns:a="http://schemas.openxmlformats.org/drawingml/2006/main" xmlns:pic="http://schemas.openxmlformats.org/drawingml/2006/picture">
+            <wp:extent cx="5029200" cy="3481754"/>
+            <wp:docPr id="8" name="Picture 8"/>
+            <wp:cNvGraphicFramePr>
+              <a:graphicFrameLocks noChangeAspect="1"/>
+            </wp:cNvGraphicFramePr>
+            <a:graphic>
+              <a:graphicData uri="http://schemas.openxmlformats.org/drawingml/2006/picture">
+                <pic:pic>
+                  <pic:nvPicPr>
+                    <pic:cNvPr id="0" name="fig5_locked_test_residual_plot.png"/>
+                    <pic:cNvPicPr/>
+                  </pic:nvPicPr>
+                  <pic:blipFill>
+                    <a:blip r:embed="rId16"/>
+                    <a:stretch>
+                      <a:fillRect/>
+                    </a:stretch>
+                  </pic:blipFill>
+                  <pic:spPr>
+                    <a:xfrm>
+                      <a:off x="0" y="0"/>
+                      <a:ext cx="5029200" cy="3481754"/>
+                    </a:xfrm>
+                    <a:prstGeom prst="rect"/>
+                  </pic:spPr>
+                </pic:pic>
+              </a:graphicData>
+            </a:graphic>
+          </wp:inline>
+        </w:drawing>
+      </w:r>
+    </w:p>
+    <w:p>
+      <w:r>
+        <w:t>Figure 5: Residual Error Distribution vs Predicted Yield.</w:t>
+      </w:r>
+    </w:p>
+    <w:p>
       <w:pPr>
         <w:pStyle w:val="Heading1"/>
       </w:pPr>
       <w:r>
-        <w:t>6. Five-Case Agronomic Error Audit</w:t>
+        <w:t>7. Five-Case Agronomic Error Audit (Framed as Hypotheses)</w:t>
+      </w:r>
+    </w:p>
+    <w:p>
+      <w:r>
+        <w:t>Per Manual Section 6 specifications, all failure causes are explicitly framed as plausible agronomic hypotheses rather than established facts:</w:t>
       </w:r>
     </w:p>
     <w:tbl>
@@ -914,18 +1267,17 @@
         <w:tblLook w:firstColumn="1" w:firstRow="1" w:lastColumn="0" w:lastRow="0" w:noHBand="0" w:noVBand="1" w:val="04A0"/>
       </w:tblPr>
       <w:tblGrid>
-        <w:gridCol w:w="1440"/>
-        <w:gridCol w:w="1440"/>
-        <w:gridCol w:w="1440"/>
-        <w:gridCol w:w="1440"/>
-        <w:gridCol w:w="1440"/>
-        <w:gridCol w:w="1440"/>
-        <w:gridCol w:w="1440"/>
+        <w:gridCol w:w="1680"/>
+        <w:gridCol w:w="1680"/>
+        <w:gridCol w:w="1680"/>
+        <w:gridCol w:w="1680"/>
+        <w:gridCol w:w="1680"/>
+        <w:gridCol w:w="1680"/>
       </w:tblGrid>
       <w:tr>
         <w:tc>
           <w:tcPr>
-            <w:tcW w:type="dxa" w:w="1440"/>
+            <w:tcW w:type="dxa" w:w="1680"/>
           </w:tcPr>
           <w:p>
             <w:r>
@@ -938,59 +1290,46 @@
         </w:tc>
         <w:tc>
           <w:tcPr>
-            <w:tcW w:type="dxa" w:w="1440"/>
+            <w:tcW w:type="dxa" w:w="1680"/>
           </w:tcPr>
           <w:p>
             <w:r>
               <w:rPr>
                 <w:b/>
               </w:rPr>
-              <w:t>District &amp; State</w:t>
+              <w:t>District (State, Season, Year)</w:t>
             </w:r>
           </w:p>
         </w:tc>
         <w:tc>
           <w:tcPr>
-            <w:tcW w:type="dxa" w:w="1440"/>
+            <w:tcW w:type="dxa" w:w="1680"/>
           </w:tcPr>
           <w:p>
             <w:r>
               <w:rPr>
                 <w:b/>
               </w:rPr>
-              <w:t>Season &amp; Year</w:t>
+              <w:t>Actual</w:t>
             </w:r>
           </w:p>
         </w:tc>
         <w:tc>
           <w:tcPr>
-            <w:tcW w:type="dxa" w:w="1440"/>
+            <w:tcW w:type="dxa" w:w="1680"/>
           </w:tcPr>
           <w:p>
             <w:r>
               <w:rPr>
                 <w:b/>
               </w:rPr>
-              <w:t>Actual (t/ha)</w:t>
+              <w:t>Predicted</w:t>
             </w:r>
           </w:p>
         </w:tc>
         <w:tc>
           <w:tcPr>
-            <w:tcW w:type="dxa" w:w="1440"/>
-          </w:tcPr>
-          <w:p>
-            <w:r>
-              <w:rPr>
-                <w:b/>
-              </w:rPr>
-              <w:t>Predicted (t/ha)</w:t>
-            </w:r>
-          </w:p>
-        </w:tc>
-        <w:tc>
-          <w:tcPr>
-            <w:tcW w:type="dxa" w:w="1440"/>
+            <w:tcW w:type="dxa" w:w="1680"/>
           </w:tcPr>
           <w:p>
             <w:r>
@@ -1003,14 +1342,14 @@
         </w:tc>
         <w:tc>
           <w:tcPr>
-            <w:tcW w:type="dxa" w:w="1440"/>
+            <w:tcW w:type="dxa" w:w="1680"/>
           </w:tcPr>
           <w:p>
             <w:r>
               <w:rPr>
                 <w:b/>
               </w:rPr>
-              <w:t>Agronomic Root Cause</w:t>
+              <w:t>Plausible Agronomic Hypothesis &amp; Agricultural Consequence</w:t>
             </w:r>
           </w:p>
         </w:tc>
@@ -1018,7 +1357,7 @@
       <w:tr>
         <w:tc>
           <w:tcPr>
-            <w:tcW w:type="dxa" w:w="1440"/>
+            <w:tcW w:type="dxa" w:w="1680"/>
           </w:tcPr>
           <w:p>
             <w:r>
@@ -1028,61 +1367,51 @@
         </w:tc>
         <w:tc>
           <w:tcPr>
-            <w:tcW w:type="dxa" w:w="1440"/>
+            <w:tcW w:type="dxa" w:w="1680"/>
           </w:tcPr>
           <w:p>
             <w:r>
-              <w:t>ARWAL, Bihar</w:t>
+              <w:t>ARWAL (Bihar, Winter 2014)</w:t>
             </w:r>
           </w:p>
         </w:tc>
         <w:tc>
           <w:tcPr>
-            <w:tcW w:type="dxa" w:w="1440"/>
+            <w:tcW w:type="dxa" w:w="1680"/>
           </w:tcPr>
           <w:p>
             <w:r>
-              <w:t>Kharif 2014</w:t>
+              <w:t>4.40 t/ha</w:t>
             </w:r>
           </w:p>
         </w:tc>
         <w:tc>
           <w:tcPr>
-            <w:tcW w:type="dxa" w:w="1440"/>
+            <w:tcW w:type="dxa" w:w="1680"/>
           </w:tcPr>
           <w:p>
             <w:r>
-              <w:t>4.4087</w:t>
+              <w:t>1.70 t/ha</w:t>
             </w:r>
           </w:p>
         </w:tc>
         <w:tc>
           <w:tcPr>
-            <w:tcW w:type="dxa" w:w="1440"/>
+            <w:tcW w:type="dxa" w:w="1680"/>
           </w:tcPr>
           <w:p>
             <w:r>
-              <w:t>1.3400</w:t>
+              <w:t>2.70 t/ha</w:t>
             </w:r>
           </w:p>
         </w:tc>
         <w:tc>
           <w:tcPr>
-            <w:tcW w:type="dxa" w:w="1440"/>
+            <w:tcW w:type="dxa" w:w="1680"/>
           </w:tcPr>
           <w:p>
             <w:r>
-              <w:t>3.0687</w:t>
-            </w:r>
-          </w:p>
-        </w:tc>
-        <w:tc>
-          <w:tcPr>
-            <w:tcW w:type="dxa" w:w="1440"/>
-          </w:tcPr>
-          <w:p>
-            <w:r>
-              <w:t>Canal command-area yield surge uncaptured by static district baseline.</w:t>
+              <w:t>Hypothesis: Atypical drought / late Kharif deficit uncaptured by static geographic features. Consequence: Deficit in regional grain reserves. Mitigation: Ingest satellite NDVI &amp; precipitation anomalies.</w:t>
             </w:r>
           </w:p>
         </w:tc>
@@ -1090,7 +1419,7 @@
       <w:tr>
         <w:tc>
           <w:tcPr>
-            <w:tcW w:type="dxa" w:w="1440"/>
+            <w:tcW w:type="dxa" w:w="1680"/>
           </w:tcPr>
           <w:p>
             <w:r>
@@ -1100,61 +1429,51 @@
         </w:tc>
         <w:tc>
           <w:tcPr>
-            <w:tcW w:type="dxa" w:w="1440"/>
+            <w:tcW w:type="dxa" w:w="1680"/>
           </w:tcPr>
           <w:p>
             <w:r>
-              <w:t>ROHTAS, Bihar</w:t>
+              <w:t>ROHTAS (Bihar, Winter 2014)</w:t>
             </w:r>
           </w:p>
         </w:tc>
         <w:tc>
           <w:tcPr>
-            <w:tcW w:type="dxa" w:w="1440"/>
+            <w:tcW w:type="dxa" w:w="1680"/>
           </w:tcPr>
           <w:p>
             <w:r>
-              <w:t>Kharif 2014</w:t>
+              <w:t>4.18 t/ha</w:t>
             </w:r>
           </w:p>
         </w:tc>
         <w:tc>
           <w:tcPr>
-            <w:tcW w:type="dxa" w:w="1440"/>
+            <w:tcW w:type="dxa" w:w="1680"/>
           </w:tcPr>
           <w:p>
             <w:r>
-              <w:t>4.1087</w:t>
+              <w:t>2.01 t/ha</w:t>
             </w:r>
           </w:p>
         </w:tc>
         <w:tc>
           <w:tcPr>
-            <w:tcW w:type="dxa" w:w="1440"/>
+            <w:tcW w:type="dxa" w:w="1680"/>
           </w:tcPr>
           <w:p>
             <w:r>
-              <w:t>1.7600</w:t>
+              <w:t>2.17 t/ha</w:t>
             </w:r>
           </w:p>
         </w:tc>
         <w:tc>
           <w:tcPr>
-            <w:tcW w:type="dxa" w:w="1440"/>
+            <w:tcW w:type="dxa" w:w="1680"/>
           </w:tcPr>
           <w:p>
             <w:r>
-              <w:t>2.3487</w:t>
-            </w:r>
-          </w:p>
-        </w:tc>
-        <w:tc>
-          <w:tcPr>
-            <w:tcW w:type="dxa" w:w="1440"/>
-          </w:tcPr>
-          <w:p>
-            <w:r>
-              <w:t>Intensive tube-well expansion yielding record harvest during dry monsoon year.</w:t>
+              <w:t>Hypothesis: Intensive canal-irrigated HYV pocket with high NPK outperforming district baseline. Consequence: Mandi storage bottlenecks. Mitigation: Ingest micro-irrigation percentage &amp; seed replacement rates.</w:t>
             </w:r>
           </w:p>
         </w:tc>
@@ -1162,7 +1481,7 @@
       <w:tr>
         <w:tc>
           <w:tcPr>
-            <w:tcW w:type="dxa" w:w="1440"/>
+            <w:tcW w:type="dxa" w:w="1680"/>
           </w:tcPr>
           <w:p>
             <w:r>
@@ -1172,61 +1491,51 @@
         </w:tc>
         <w:tc>
           <w:tcPr>
-            <w:tcW w:type="dxa" w:w="1440"/>
+            <w:tcW w:type="dxa" w:w="1680"/>
           </w:tcPr>
           <w:p>
             <w:r>
-              <w:t>DEOGARH, Odisha</w:t>
+              <w:t>DEOGARH (Odisha, Winter 2014)</w:t>
             </w:r>
           </w:p>
         </w:tc>
         <w:tc>
           <w:tcPr>
-            <w:tcW w:type="dxa" w:w="1440"/>
+            <w:tcW w:type="dxa" w:w="1680"/>
           </w:tcPr>
           <w:p>
             <w:r>
-              <w:t>Autumn 2014</w:t>
+              <w:t>3.48 t/ha</w:t>
             </w:r>
           </w:p>
         </w:tc>
         <w:tc>
           <w:tcPr>
-            <w:tcW w:type="dxa" w:w="1440"/>
+            <w:tcW w:type="dxa" w:w="1680"/>
           </w:tcPr>
           <w:p>
             <w:r>
-              <w:t>4.6068</w:t>
+              <w:t>1.34 t/ha</w:t>
             </w:r>
           </w:p>
         </w:tc>
         <w:tc>
           <w:tcPr>
-            <w:tcW w:type="dxa" w:w="1440"/>
+            <w:tcW w:type="dxa" w:w="1680"/>
           </w:tcPr>
           <w:p>
             <w:r>
-              <w:t>2.2900</w:t>
+              <w:t>2.14 t/ha</w:t>
             </w:r>
           </w:p>
         </w:tc>
         <w:tc>
           <w:tcPr>
-            <w:tcW w:type="dxa" w:w="1440"/>
+            <w:tcW w:type="dxa" w:w="1680"/>
           </w:tcPr>
           <w:p>
             <w:r>
-              <w:t>2.3168</w:t>
-            </w:r>
-          </w:p>
-        </w:tc>
-        <w:tc>
-          <w:tcPr>
-            <w:tcW w:type="dxa" w:w="1440"/>
-          </w:tcPr>
-          <w:p>
-            <w:r>
-              <w:t>Autumn season upland paddy anomaly driven by localized high-yield hybrid seeds.</w:t>
+              <w:t>Hypothesis: Localized pest outbreak / blast disease causing premature lodging in lowland rice. Consequence: Misallocated procurement logistics. Mitigation: Integrate pest-surveillance early warning alerts.</w:t>
             </w:r>
           </w:p>
         </w:tc>
@@ -1234,7 +1543,7 @@
       <w:tr>
         <w:tc>
           <w:tcPr>
-            <w:tcW w:type="dxa" w:w="1440"/>
+            <w:tcW w:type="dxa" w:w="1680"/>
           </w:tcPr>
           <w:p>
             <w:r>
@@ -1244,61 +1553,51 @@
         </w:tc>
         <w:tc>
           <w:tcPr>
-            <w:tcW w:type="dxa" w:w="1440"/>
+            <w:tcW w:type="dxa" w:w="1680"/>
           </w:tcPr>
           <w:p>
             <w:r>
-              <w:t>SHEIKHPURA, Bihar</w:t>
+              <w:t>SHEIKHPURA (Bihar, Winter 2014)</w:t>
             </w:r>
           </w:p>
         </w:tc>
         <w:tc>
           <w:tcPr>
-            <w:tcW w:type="dxa" w:w="1440"/>
+            <w:tcW w:type="dxa" w:w="1680"/>
           </w:tcPr>
           <w:p>
             <w:r>
-              <w:t>Kharif 2014</w:t>
+              <w:t>3.81 t/ha</w:t>
             </w:r>
           </w:p>
         </w:tc>
         <w:tc>
           <w:tcPr>
-            <w:tcW w:type="dxa" w:w="1440"/>
+            <w:tcW w:type="dxa" w:w="1680"/>
           </w:tcPr>
           <w:p>
             <w:r>
-              <w:t>3.9926</w:t>
+              <w:t>1.71 t/ha</w:t>
             </w:r>
           </w:p>
         </w:tc>
         <w:tc>
           <w:tcPr>
-            <w:tcW w:type="dxa" w:w="1440"/>
+            <w:tcW w:type="dxa" w:w="1680"/>
           </w:tcPr>
           <w:p>
             <w:r>
-              <w:t>1.7000</w:t>
+              <w:t>2.10 t/ha</w:t>
             </w:r>
           </w:p>
         </w:tc>
         <w:tc>
           <w:tcPr>
-            <w:tcW w:type="dxa" w:w="1440"/>
+            <w:tcW w:type="dxa" w:w="1680"/>
           </w:tcPr>
           <w:p>
             <w:r>
-              <w:t>2.2926</w:t>
-            </w:r>
-          </w:p>
-        </w:tc>
-        <w:tc>
-          <w:tcPr>
-            <w:tcW w:type="dxa" w:w="1440"/>
-          </w:tcPr>
-          <w:p>
-            <w:r>
-              <w:t>SRI (System of Rice Intensification) adoption causing non-linear yield jump.</w:t>
+              <w:t>Hypothesis: Extreme flood inundation causing partial harvest abandonment in riverine tract. Consequence: Failure to trigger timely insurance payouts (PMFBY). Mitigation: Fuse SAR flood extent inundation masks.</w:t>
             </w:r>
           </w:p>
         </w:tc>
@@ -1306,7 +1605,7 @@
       <w:tr>
         <w:tc>
           <w:tcPr>
-            <w:tcW w:type="dxa" w:w="1440"/>
+            <w:tcW w:type="dxa" w:w="1680"/>
           </w:tcPr>
           <w:p>
             <w:r>
@@ -1316,61 +1615,51 @@
         </w:tc>
         <w:tc>
           <w:tcPr>
-            <w:tcW w:type="dxa" w:w="1440"/>
+            <w:tcW w:type="dxa" w:w="1680"/>
           </w:tcPr>
           <w:p>
             <w:r>
-              <w:t>LAKHISARAI, Bihar</w:t>
+              <w:t>LAKHISARAI (Bihar, Winter 2014)</w:t>
             </w:r>
           </w:p>
         </w:tc>
         <w:tc>
           <w:tcPr>
-            <w:tcW w:type="dxa" w:w="1440"/>
+            <w:tcW w:type="dxa" w:w="1680"/>
           </w:tcPr>
           <w:p>
             <w:r>
-              <w:t>Kharif 2014</w:t>
+              <w:t>3.69 t/ha</w:t>
             </w:r>
           </w:p>
         </w:tc>
         <w:tc>
           <w:tcPr>
-            <w:tcW w:type="dxa" w:w="1440"/>
+            <w:tcW w:type="dxa" w:w="1680"/>
           </w:tcPr>
           <w:p>
             <w:r>
-              <w:t>3.7745</w:t>
+              <w:t>1.69 t/ha</w:t>
             </w:r>
           </w:p>
         </w:tc>
         <w:tc>
           <w:tcPr>
-            <w:tcW w:type="dxa" w:w="1440"/>
+            <w:tcW w:type="dxa" w:w="1680"/>
           </w:tcPr>
           <w:p>
             <w:r>
-              <w:t>1.6300</w:t>
+              <w:t>1.99 t/ha</w:t>
             </w:r>
           </w:p>
         </w:tc>
         <w:tc>
           <w:tcPr>
-            <w:tcW w:type="dxa" w:w="1440"/>
+            <w:tcW w:type="dxa" w:w="1680"/>
           </w:tcPr>
           <w:p>
             <w:r>
-              <w:t>2.1445</w:t>
-            </w:r>
-          </w:p>
-        </w:tc>
-        <w:tc>
-          <w:tcPr>
-            <w:tcW w:type="dxa" w:w="1440"/>
-          </w:tcPr>
-          <w:p>
-            <w:r>
-              <w:t>Tal land alluvial post-flood siltation creating unexpected natural fertility.</w:t>
+              <w:t>Hypothesis: High agro-ecological variance across tribal/hilly tracts masking localized yield. Consequence: Sub-optimal fertilizer distribution quotas. Mitigation: Refine spatial resolution to block/taluk granularity.</w:t>
             </w:r>
           </w:p>
         </w:tc>
@@ -1381,12 +1670,313 @@
         <w:pStyle w:val="Heading1"/>
       </w:pPr>
       <w:r>
-        <w:t>7. Operational Governance &amp; Academic Sign-Off</w:t>
+        <w:t>8. Responsible Analytics, Operational Limitations &amp; Governance</w:t>
       </w:r>
     </w:p>
     <w:p>
       <w:r>
-        <w:t>I hereby declare that this research report and computational pipeline represent original work completed in strict adherence to academic integrity standards and the Experiment 08 Manual Version 3.0 specification.</w:t>
+        <w:t>Operational Boundaries: Predictions are valid strictly for macro-level planning by agricultural agencies before harvest commences. The model is calibrated for 1–3 year temporal forecasting horizons; multi-decade extrapolation is prohibited without re-calibration. Uncalibrated districts fall back to state-level empirical medians with automated low-confidence telemetry warnings.</w:t>
+        <w:br/>
+        <w:br/>
+        <w:t>Ethical Governance &amp; Risk Mitigation: Model predictions must never be utilized to restrict agricultural credit access or deny crop insurance indemnities (e.g., PMFBY) to smallholder farmers.</w:t>
+      </w:r>
+    </w:p>
+    <w:p>
+      <w:pPr>
+        <w:pStyle w:val="Heading1"/>
+      </w:pPr>
+      <w:r>
+        <w:t>9. Reproducibility Checklist &amp; Cryptographic Verification</w:t>
+      </w:r>
+    </w:p>
+    <w:tbl>
+      <w:tblPr>
+        <w:tblW w:type="auto" w:w="0"/>
+        <w:jc w:val="center"/>
+        <w:tblLook w:firstColumn="1" w:firstRow="1" w:lastColumn="0" w:lastRow="0" w:noHBand="0" w:noVBand="1" w:val="04A0"/>
+      </w:tblPr>
+      <w:tblGrid>
+        <w:gridCol w:w="2520"/>
+        <w:gridCol w:w="2520"/>
+        <w:gridCol w:w="2520"/>
+        <w:gridCol w:w="2520"/>
+      </w:tblGrid>
+      <w:tr>
+        <w:tc>
+          <w:tcPr>
+            <w:tcW w:type="dxa" w:w="2520"/>
+          </w:tcPr>
+          <w:p>
+            <w:r>
+              <w:rPr>
+                <w:b/>
+              </w:rPr>
+              <w:t>Artifact / Verification Check</w:t>
+            </w:r>
+          </w:p>
+        </w:tc>
+        <w:tc>
+          <w:tcPr>
+            <w:tcW w:type="dxa" w:w="2520"/>
+          </w:tcPr>
+          <w:p>
+            <w:r>
+              <w:rPr>
+                <w:b/>
+              </w:rPr>
+              <w:t>Storage Path</w:t>
+            </w:r>
+          </w:p>
+        </w:tc>
+        <w:tc>
+          <w:tcPr>
+            <w:tcW w:type="dxa" w:w="2520"/>
+          </w:tcPr>
+          <w:p>
+            <w:r>
+              <w:rPr>
+                <w:b/>
+              </w:rPr>
+              <w:t>Cryptographic Seal / Output Status</w:t>
+            </w:r>
+          </w:p>
+        </w:tc>
+        <w:tc>
+          <w:tcPr>
+            <w:tcW w:type="dxa" w:w="2520"/>
+          </w:tcPr>
+          <w:p>
+            <w:r>
+              <w:rPr>
+                <w:b/>
+              </w:rPr>
+              <w:t>Audit Status</w:t>
+            </w:r>
+          </w:p>
+        </w:tc>
+      </w:tr>
+      <w:tr>
+        <w:tc>
+          <w:tcPr>
+            <w:tcW w:type="dxa" w:w="2520"/>
+          </w:tcPr>
+          <w:p>
+            <w:r>
+              <w:t>Primary Raw APY Data (D1)</w:t>
+            </w:r>
+          </w:p>
+        </w:tc>
+        <w:tc>
+          <w:tcPr>
+            <w:tcW w:type="dxa" w:w="2520"/>
+          </w:tcPr>
+          <w:p>
+            <w:r>
+              <w:t>data/raw/crop_production.csv</w:t>
+            </w:r>
+          </w:p>
+        </w:tc>
+        <w:tc>
+          <w:tcPr>
+            <w:tcW w:type="dxa" w:w="2520"/>
+          </w:tcPr>
+          <w:p>
+            <w:r>
+              <w:t>SHA-256: 5b2637058ca4aff2ef7c0e0f2f391bca712300d082693b585f489871fd91d520</w:t>
+            </w:r>
+          </w:p>
+        </w:tc>
+        <w:tc>
+          <w:tcPr>
+            <w:tcW w:type="dxa" w:w="2520"/>
+          </w:tcPr>
+          <w:p>
+            <w:r>
+              <w:t>100% VERIFIED</w:t>
+            </w:r>
+          </w:p>
+        </w:tc>
+      </w:tr>
+      <w:tr>
+        <w:tc>
+          <w:tcPr>
+            <w:tcW w:type="dxa" w:w="2520"/>
+          </w:tcPr>
+          <w:p>
+            <w:r>
+              <w:t>Extension 1 Raw Data</w:t>
+            </w:r>
+          </w:p>
+        </w:tc>
+        <w:tc>
+          <w:tcPr>
+            <w:tcW w:type="dxa" w:w="2520"/>
+          </w:tcPr>
+          <w:p>
+            <w:r>
+              <w:t>data/raw/crop_recommendation.csv</w:t>
+            </w:r>
+          </w:p>
+        </w:tc>
+        <w:tc>
+          <w:tcPr>
+            <w:tcW w:type="dxa" w:w="2520"/>
+          </w:tcPr>
+          <w:p>
+            <w:r>
+              <w:t>SHA-256: 808e1d84a544647f1ab2fdae04f434b1842692d6be09eee18a5c2d43eb78d77c</w:t>
+            </w:r>
+          </w:p>
+        </w:tc>
+        <w:tc>
+          <w:tcPr>
+            <w:tcW w:type="dxa" w:w="2520"/>
+          </w:tcPr>
+          <w:p>
+            <w:r>
+              <w:t>100% VERIFIED</w:t>
+            </w:r>
+          </w:p>
+        </w:tc>
+      </w:tr>
+      <w:tr>
+        <w:tc>
+          <w:tcPr>
+            <w:tcW w:type="dxa" w:w="2520"/>
+          </w:tcPr>
+          <w:p>
+            <w:r>
+              <w:t>Regression Model Bundle</w:t>
+            </w:r>
+          </w:p>
+        </w:tc>
+        <w:tc>
+          <w:tcPr>
+            <w:tcW w:type="dxa" w:w="2520"/>
+          </w:tcPr>
+          <w:p>
+            <w:r>
+              <w:t>models/selected_bundle.joblib</w:t>
+            </w:r>
+          </w:p>
+        </w:tc>
+        <w:tc>
+          <w:tcPr>
+            <w:tcW w:type="dxa" w:w="2520"/>
+          </w:tcPr>
+          <w:p>
+            <w:r>
+              <w:t>Encapsulated Scikit-Learn Pipeline + Metadata</w:t>
+            </w:r>
+          </w:p>
+        </w:tc>
+        <w:tc>
+          <w:tcPr>
+            <w:tcW w:type="dxa" w:w="2520"/>
+          </w:tcPr>
+          <w:p>
+            <w:r>
+              <w:t>100% VERIFIED</w:t>
+            </w:r>
+          </w:p>
+        </w:tc>
+      </w:tr>
+      <w:tr>
+        <w:tc>
+          <w:tcPr>
+            <w:tcW w:type="dxa" w:w="2520"/>
+          </w:tcPr>
+          <w:p>
+            <w:r>
+              <w:t>Classification Model Bundle</w:t>
+            </w:r>
+          </w:p>
+        </w:tc>
+        <w:tc>
+          <w:tcPr>
+            <w:tcW w:type="dxa" w:w="2520"/>
+          </w:tcPr>
+          <w:p>
+            <w:r>
+              <w:t>models/classification_bundle.joblib</w:t>
+            </w:r>
+          </w:p>
+        </w:tc>
+        <w:tc>
+          <w:tcPr>
+            <w:tcW w:type="dxa" w:w="2520"/>
+          </w:tcPr>
+          <w:p>
+            <w:r>
+              <w:t>RandomForestClassifier + Per-Class Metrics</w:t>
+            </w:r>
+          </w:p>
+        </w:tc>
+        <w:tc>
+          <w:tcPr>
+            <w:tcW w:type="dxa" w:w="2520"/>
+          </w:tcPr>
+          <w:p>
+            <w:r>
+              <w:t>100% VERIFIED</w:t>
+            </w:r>
+          </w:p>
+        </w:tc>
+      </w:tr>
+      <w:tr>
+        <w:tc>
+          <w:tcPr>
+            <w:tcW w:type="dxa" w:w="2520"/>
+          </w:tcPr>
+          <w:p>
+            <w:r>
+              <w:t>Automated Verification Suite</w:t>
+            </w:r>
+          </w:p>
+        </w:tc>
+        <w:tc>
+          <w:tcPr>
+            <w:tcW w:type="dxa" w:w="2520"/>
+          </w:tcPr>
+          <w:p>
+            <w:r>
+              <w:t>verify_submission.py</w:t>
+            </w:r>
+          </w:p>
+        </w:tc>
+        <w:tc>
+          <w:tcPr>
+            <w:tcW w:type="dxa" w:w="2520"/>
+          </w:tcPr>
+          <w:p>
+            <w:r>
+              <w:t>100% assertions pass with zero warnings or errors</w:t>
+            </w:r>
+          </w:p>
+        </w:tc>
+        <w:tc>
+          <w:tcPr>
+            <w:tcW w:type="dxa" w:w="2520"/>
+          </w:tcPr>
+          <w:p>
+            <w:r>
+              <w:t>100% PASSING</w:t>
+            </w:r>
+          </w:p>
+        </w:tc>
+      </w:tr>
+    </w:tbl>
+    <w:p>
+      <w:pPr>
+        <w:pStyle w:val="Heading1"/>
+      </w:pPr>
+      <w:r>
+        <w:t>10. Academic Integrity &amp; Academic Sign-Off</w:t>
+      </w:r>
+    </w:p>
+    <w:p>
+      <w:r>
+        <w:t>I hereby declare that this research report and the accompanying computational pipeline represent original work completed in strict adherence to academic integrity standards and the Experiment 08 Manual Version 3.0 specification. All figures, tables, and reported performance metrics were programmatically generated from authentic data without post-hoc fabrication.</w:t>
         <w:br/>
         <w:br/>
         <w:t>Student Name: Lokanth S | Registration Number: 23MID0037 | Faculty: Dr. Durgesh Kumar | Date: September 15, 2026</w:t>

</xml_diff>

<commit_message>
Add source audit table, preprocessing fit scope evidence, per-year robustness, and crop-label terminology
</commit_message>
<xml_diff>
--- a/23MID0037_Lab08_Report.docx
+++ b/23MID0037_Lab08_Report.docx
@@ -14,7 +14,7 @@
         </w:rPr>
         <w:t>MDI3003 Advanced Predictive Analytics — Experiment 08</w:t>
         <w:br/>
-        <w:t>Agricultural Predictive Analytics: District-Level Rice Yield Forecasting with a Guided Multi-Class Crop Classification Extension</w:t>
+        <w:t>Agricultural Predictive Analytics: District-Level Rice Yield Forecasting with a Guided Multi-Class Crop-Label Classification Extension</w:t>
         <w:br/>
       </w:r>
     </w:p>
@@ -206,7 +206,7 @@
     </w:p>
     <w:p>
       <w:r>
-        <w:t>This laboratory report presents an empirical investigation into regional rice yield prediction and multi-class crop recommendation under Manual Version 3.0 protocols. The core regression task forecasts district-level rice yield in metric tonnes per hectare (t/ha) using strictly pre-season administrative covariates (state, district, season, year), while strictly barring harvested production and area to prevent algebraic target leakage (Y = P/A). On an authentic panel of 15,078 clean rice observations (1997–2015) partitioned chronologically (1997–2011 Train, 2012–2013 Val, 2014–2015 Test), Ridge trend regression achieved superior generalization (Validation MAE: 0.4748 t/ha, Locked Test MAE: 0.4497 t/ha, Test R²: 0.5068) outperforming the predeclared historical median baseline (Test MAE: 0.7638 t/ha, -41.1% error reduction). In Extension 1, a three-candidate validation benchmark on an identical 60/20/20 stratified split established Random Forest as the winner (Val Macro-F1: 0.9886 vs Logistic: 0.9728 vs Majority: 0.0040), achieving 99.77% Locked Test Macro-F1 across 22 crop classes.</w:t>
+        <w:t>This laboratory report presents an empirical investigation into regional rice yield prediction and multi-class crop-label classification under Manual Version 3.0 protocols. The core regression task forecasts district-level rice yield in metric tonnes per hectare (t/ha) using strictly pre-season administrative covariates (state, district, season, year), while strictly barring harvested production and area to prevent algebraic target leakage (Y = P/A). On an authentic panel of 15,078 clean rice observations (1997–2015) partitioned chronologically (1997–2011 Train, 2012–2013 Val, 2014–2015 Test), Ridge trend regression achieved superior generalization (Validation MAE: 0.4748 t/ha, Locked Test MAE: 0.4497 t/ha, Test R²: 0.5068) outperforming the predeclared historical median baseline (Test MAE: 0.7638 t/ha, -41.1% error reduction). In Extension 1, a three-candidate validation benchmark on an identical 60/20/20 stratified split established Random Forest as the winner (Val Macro-F1: 0.9886 vs Logistic: 0.9728 vs Majority: 0.0040), achieving 99.77% Locked Test Macro-F1 across 22 crop classes. Per the manual's core warning, the classification task classifies dataset labels and does not establish an agronomically optimal crop choice or farming prescription.</w:t>
       </w:r>
     </w:p>
     <w:p>
@@ -219,7 +219,7 @@
     </w:p>
     <w:p>
       <w:r>
-        <w:t>Continuous regression estimates yield in t/ha from x = (State, District, Season, Year)^T minimizing expected MAE. Multi-class classification recommends one of 22 crops from z = (N, P, K, Temp, Humidity, pH, Rainfall)^T maximizing Macro-F1. In agricultural records, Yield = Production / Area. Admitting Production into predictors causes algebraic reconstruction (R² = 1.0) rather than predictive forecasting. Production is unknown pre-season, making its exclusion strictly required.</w:t>
+        <w:t>Continuous regression estimates yield in t/ha from x = (State, District, Season, Year)^T minimizing expected MAE. Multi-class classification classifies observations into one of 22 crop classes from z = (N, P, K, Temp, Humidity, pH, Rainfall)^T maximizing Macro-F1. In agricultural records, Yield = Production / Area. Admitting Production into predictors causes algebraic reconstruction (R² = 1.0) rather than predictive forecasting. Production is unknown pre-season, making its exclusion strictly required.</w:t>
       </w:r>
     </w:p>
     <w:p>
@@ -227,14 +227,355 @@
         <w:pStyle w:val="Heading1"/>
       </w:pPr>
       <w:r>
-        <w:t>2. Data Governance &amp; Split Protocol</w:t>
+        <w:t>2. Data Governance Record, Provenance Audits &amp; Unit Conversion Log</w:t>
       </w:r>
     </w:p>
     <w:p>
       <w:r>
-        <w:t>Per Section 1 priority hierarchy, D5 (DOI 10.17632/ywp3y5j9vv.1) was probed first: metadata snapshot confirmed valid CC BY 4.0 license but an empty file list (files: []). Primary candidate D1 (GoI APY) was acquired and verified (15,078 clean rice observations). Chronological regression split: Training (1997–2011, 12,588 rows, 83.49%), Validation (2012–2013, 1,644 rows, 10.90%), Locked Test (2014–2015, 846 rows, 5.61%).</w:t>
+        <w:t>Per Section 1 priority hierarchy, D5 (DOI 10.17632/ywp3y5j9vv.1) was probed first: metadata snapshot confirmed valid CC BY 4.0 license but an empty file list (files: []). Primary candidate D1 (GoI APY) was acquired and verified (15,078 clean rice observations). Below is the complete verifiable governance record:</w:t>
       </w:r>
     </w:p>
+    <w:tbl>
+      <w:tblPr>
+        <w:tblW w:type="auto" w:w="0"/>
+        <w:jc w:val="center"/>
+        <w:tblLook w:firstColumn="1" w:firstRow="1" w:lastColumn="0" w:lastRow="0" w:noHBand="0" w:noVBand="1" w:val="04A0"/>
+      </w:tblPr>
+      <w:tblGrid>
+        <w:gridCol w:w="3360"/>
+        <w:gridCol w:w="3360"/>
+        <w:gridCol w:w="3360"/>
+      </w:tblGrid>
+      <w:tr>
+        <w:tc>
+          <w:tcPr>
+            <w:tcW w:type="dxa" w:w="3360"/>
+          </w:tcPr>
+          <w:p>
+            <w:r>
+              <w:rPr>
+                <w:b/>
+              </w:rPr>
+              <w:t>Governance Attribute</w:t>
+            </w:r>
+          </w:p>
+        </w:tc>
+        <w:tc>
+          <w:tcPr>
+            <w:tcW w:type="dxa" w:w="3360"/>
+          </w:tcPr>
+          <w:p>
+            <w:r>
+              <w:rPr>
+                <w:b/>
+              </w:rPr>
+              <w:t>Primary Dataset (D1 APY)</w:t>
+            </w:r>
+          </w:p>
+        </w:tc>
+        <w:tc>
+          <w:tcPr>
+            <w:tcW w:type="dxa" w:w="3360"/>
+          </w:tcPr>
+          <w:p>
+            <w:r>
+              <w:rPr>
+                <w:b/>
+              </w:rPr>
+              <w:t>Classification Dataset (D3)</w:t>
+            </w:r>
+          </w:p>
+        </w:tc>
+      </w:tr>
+      <w:tr>
+        <w:tc>
+          <w:tcPr>
+            <w:tcW w:type="dxa" w:w="3360"/>
+          </w:tcPr>
+          <w:p>
+            <w:r>
+              <w:t>Source Name &amp; Publisher</w:t>
+            </w:r>
+          </w:p>
+        </w:tc>
+        <w:tc>
+          <w:tcPr>
+            <w:tcW w:type="dxa" w:w="3360"/>
+          </w:tcPr>
+          <w:p>
+            <w:r>
+              <w:t>Ministry of Agriculture &amp; Farmers Welfare, GoI</w:t>
+            </w:r>
+          </w:p>
+        </w:tc>
+        <w:tc>
+          <w:tcPr>
+            <w:tcW w:type="dxa" w:w="3360"/>
+          </w:tcPr>
+          <w:p>
+            <w:r>
+              <w:t>Open Agro-Ecological Benchmark (Atharva Ingle)</w:t>
+            </w:r>
+          </w:p>
+        </w:tc>
+      </w:tr>
+      <w:tr>
+        <w:tc>
+          <w:tcPr>
+            <w:tcW w:type="dxa" w:w="3360"/>
+          </w:tcPr>
+          <w:p>
+            <w:r>
+              <w:t>Source URL / Endpoint</w:t>
+            </w:r>
+          </w:p>
+        </w:tc>
+        <w:tc>
+          <w:tcPr>
+            <w:tcW w:type="dxa" w:w="3360"/>
+          </w:tcPr>
+          <w:p>
+            <w:r>
+              <w:t>https://aps.dac.gov.in/ (data.gov.in portal)</w:t>
+            </w:r>
+          </w:p>
+        </w:tc>
+        <w:tc>
+          <w:tcPr>
+            <w:tcW w:type="dxa" w:w="3360"/>
+          </w:tcPr>
+          <w:p>
+            <w:r>
+              <w:t>https://www.kaggle.com/datasets/...</w:t>
+            </w:r>
+          </w:p>
+        </w:tc>
+      </w:tr>
+      <w:tr>
+        <w:tc>
+          <w:tcPr>
+            <w:tcW w:type="dxa" w:w="3360"/>
+          </w:tcPr>
+          <w:p>
+            <w:r>
+              <w:t>Download / Ingest Date</w:t>
+            </w:r>
+          </w:p>
+        </w:tc>
+        <w:tc>
+          <w:tcPr>
+            <w:tcW w:type="dxa" w:w="3360"/>
+          </w:tcPr>
+          <w:p>
+            <w:r>
+              <w:t>September 7, 2026</w:t>
+            </w:r>
+          </w:p>
+        </w:tc>
+        <w:tc>
+          <w:tcPr>
+            <w:tcW w:type="dxa" w:w="3360"/>
+          </w:tcPr>
+          <w:p>
+            <w:r>
+              <w:t>September 7, 2026</w:t>
+            </w:r>
+          </w:p>
+        </w:tc>
+      </w:tr>
+      <w:tr>
+        <w:tc>
+          <w:tcPr>
+            <w:tcW w:type="dxa" w:w="3360"/>
+          </w:tcPr>
+          <w:p>
+            <w:r>
+              <w:t>Original Raw File &amp; Size</w:t>
+            </w:r>
+          </w:p>
+        </w:tc>
+        <w:tc>
+          <w:tcPr>
+            <w:tcW w:type="dxa" w:w="3360"/>
+          </w:tcPr>
+          <w:p>
+            <w:r>
+              <w:t>crop_production.csv (15,316,741 bytes)</w:t>
+            </w:r>
+          </w:p>
+        </w:tc>
+        <w:tc>
+          <w:tcPr>
+            <w:tcW w:type="dxa" w:w="3360"/>
+          </w:tcPr>
+          <w:p>
+            <w:r>
+              <w:t>crop_recommendation.csv (147,833 bytes)</w:t>
+            </w:r>
+          </w:p>
+        </w:tc>
+      </w:tr>
+      <w:tr>
+        <w:tc>
+          <w:tcPr>
+            <w:tcW w:type="dxa" w:w="3360"/>
+          </w:tcPr>
+          <w:p>
+            <w:r>
+              <w:t>Raw Rows &amp; Exclusions</w:t>
+            </w:r>
+          </w:p>
+        </w:tc>
+        <w:tc>
+          <w:tcPr>
+            <w:tcW w:type="dxa" w:w="3360"/>
+          </w:tcPr>
+          <w:p>
+            <w:r>
+              <w:t>246,091 raw rows (231,013 non-rice/invalid excluded)</w:t>
+            </w:r>
+          </w:p>
+        </w:tc>
+        <w:tc>
+          <w:tcPr>
+            <w:tcW w:type="dxa" w:w="3360"/>
+          </w:tcPr>
+          <w:p>
+            <w:r>
+              <w:t>2,200 raw rows (0 excluded; 22 classes balanced)</w:t>
+            </w:r>
+          </w:p>
+        </w:tc>
+      </w:tr>
+      <w:tr>
+        <w:tc>
+          <w:tcPr>
+            <w:tcW w:type="dxa" w:w="3360"/>
+          </w:tcPr>
+          <w:p>
+            <w:r>
+              <w:t>Retained Clean Panel</w:t>
+            </w:r>
+          </w:p>
+        </w:tc>
+        <w:tc>
+          <w:tcPr>
+            <w:tcW w:type="dxa" w:w="3360"/>
+          </w:tcPr>
+          <w:p>
+            <w:r>
+              <w:t>15,078 clean rice observations (1997–2015)</w:t>
+            </w:r>
+          </w:p>
+        </w:tc>
+        <w:tc>
+          <w:tcPr>
+            <w:tcW w:type="dxa" w:w="3360"/>
+          </w:tcPr>
+          <w:p>
+            <w:r>
+              <w:t>2,200 balanced records (100 samples/class)</w:t>
+            </w:r>
+          </w:p>
+        </w:tc>
+      </w:tr>
+      <w:tr>
+        <w:tc>
+          <w:tcPr>
+            <w:tcW w:type="dxa" w:w="3360"/>
+          </w:tcPr>
+          <w:p>
+            <w:r>
+              <w:t>Original Units &amp; Schema</w:t>
+            </w:r>
+          </w:p>
+        </w:tc>
+        <w:tc>
+          <w:tcPr>
+            <w:tcW w:type="dxa" w:w="3360"/>
+          </w:tcPr>
+          <w:p>
+            <w:r>
+              <w:t>Area: Hectares (ha), Production: Tonnes (t)</w:t>
+            </w:r>
+          </w:p>
+        </w:tc>
+        <w:tc>
+          <w:tcPr>
+            <w:tcW w:type="dxa" w:w="3360"/>
+          </w:tcPr>
+          <w:p>
+            <w:r>
+              <w:t>N, P, K (mg/kg), T (°C), H (%), pH, Rainfall (mm)</w:t>
+            </w:r>
+          </w:p>
+        </w:tc>
+      </w:tr>
+      <w:tr>
+        <w:tc>
+          <w:tcPr>
+            <w:tcW w:type="dxa" w:w="3360"/>
+          </w:tcPr>
+          <w:p>
+            <w:r>
+              <w:t>Converted Target Variable</w:t>
+            </w:r>
+          </w:p>
+        </w:tc>
+        <w:tc>
+          <w:tcPr>
+            <w:tcW w:type="dxa" w:w="3360"/>
+          </w:tcPr>
+          <w:p>
+            <w:r>
+              <w:t>yield_t_ha = Production / Area (in metric t/ha)</w:t>
+            </w:r>
+          </w:p>
+        </w:tc>
+        <w:tc>
+          <w:tcPr>
+            <w:tcW w:type="dxa" w:w="3360"/>
+          </w:tcPr>
+          <w:p>
+            <w:r>
+              <w:t>Categorical label: crop (22 classes)</w:t>
+            </w:r>
+          </w:p>
+        </w:tc>
+      </w:tr>
+      <w:tr>
+        <w:tc>
+          <w:tcPr>
+            <w:tcW w:type="dxa" w:w="3360"/>
+          </w:tcPr>
+          <w:p>
+            <w:r>
+              <w:t>Cryptographic SHA-256</w:t>
+            </w:r>
+          </w:p>
+        </w:tc>
+        <w:tc>
+          <w:tcPr>
+            <w:tcW w:type="dxa" w:w="3360"/>
+          </w:tcPr>
+          <w:p>
+            <w:r>
+              <w:t>5b2637058ca4aff2ef7c0e0f2f391bca712300d082693b585f489871fd91d520</w:t>
+            </w:r>
+          </w:p>
+        </w:tc>
+        <w:tc>
+          <w:tcPr>
+            <w:tcW w:type="dxa" w:w="3360"/>
+          </w:tcPr>
+          <w:p>
+            <w:r>
+              <w:t>808e1d84a544647f1ab2fdae04f434b1842692d6be09eee18a5c2d43eb78d77c</w:t>
+            </w:r>
+          </w:p>
+        </w:tc>
+      </w:tr>
+    </w:tbl>
     <w:p>
       <w:pPr>
         <w:pStyle w:val="Heading1"/>
@@ -335,7 +676,14 @@
         <w:pStyle w:val="Heading1"/>
       </w:pPr>
       <w:r>
-        <w:t>4. Regression Validation Results &amp; Extension 2 Ablation</w:t>
+        <w:t>4. Preprocessing Fit Scope Evidence &amp; Regression Validation</w:t>
+      </w:r>
+    </w:p>
+    <w:p>
+      <w:r>
+        <w:t>Chronological Split: Training (1997–2011, 12,588 rows, 83.49%), Validation (2012–2013, 1,644 rows, 10.90%), Locked Test (2014–2015, 846 rows, 5.61%).</w:t>
+        <w:br/>
+        <w:t>Preprocessing Implementation: Categorical features (state, district, season) were encoded via OneHotEncoder(handle_unknown='ignore'). The continuous feature year was processed via SimpleImputer(strategy='median') and StandardScaler. The entire pipeline was fitted exclusively on training rows. Verification confirmed that validation-only categories did not enter learned encoder categories.</w:t>
       </w:r>
     </w:p>
     <w:tbl>
@@ -734,7 +1082,12 @@
         <w:pStyle w:val="Heading1"/>
       </w:pPr>
       <w:r>
-        <w:t>5. Extension 1 Classification Validation Results (All 3 Candidates)</w:t>
+        <w:t>5. Extension 1: Multi-Class Crop-Label Classification Validation</w:t>
+      </w:r>
+    </w:p>
+    <w:p>
+      <w:r>
+        <w:t>Independence Review Note: iid_justified=True is documented because observations represent point-in-time physicochemical soil profiles without serial autoregression. The model classifies observations into 22 crop classes (not farming advice).</w:t>
       </w:r>
     </w:p>
     <w:tbl>
@@ -1146,7 +1499,7 @@
         <w:pStyle w:val="Heading1"/>
       </w:pPr>
       <w:r>
-        <w:t>6. Locked-Test Out-of-Sample Results</w:t>
+        <w:t>6. Locked-Test Out-of-Sample Results &amp; Per-Year Robustness</w:t>
       </w:r>
     </w:p>
     <w:p>
@@ -1165,6 +1518,225 @@
         <w:t>• Winning Random Forest: Test Accuracy = 0.9977 (439/440 correct), Test Macro-F1 = 0.9977, Macro-Precision = 0.9978, Macro-Recall = 0.9977</w:t>
       </w:r>
     </w:p>
+    <w:tbl>
+      <w:tblPr>
+        <w:tblW w:type="auto" w:w="0"/>
+        <w:jc w:val="center"/>
+        <w:tblLook w:firstColumn="1" w:firstRow="1" w:lastColumn="0" w:lastRow="0" w:noHBand="0" w:noVBand="1" w:val="04A0"/>
+      </w:tblPr>
+      <w:tblGrid>
+        <w:gridCol w:w="1680"/>
+        <w:gridCol w:w="1680"/>
+        <w:gridCol w:w="1680"/>
+        <w:gridCol w:w="1680"/>
+        <w:gridCol w:w="1680"/>
+        <w:gridCol w:w="1680"/>
+      </w:tblGrid>
+      <w:tr>
+        <w:tc>
+          <w:tcPr>
+            <w:tcW w:type="dxa" w:w="1680"/>
+          </w:tcPr>
+          <w:p>
+            <w:r>
+              <w:rPr>
+                <w:b/>
+              </w:rPr>
+              <w:t>Test Year</w:t>
+            </w:r>
+          </w:p>
+        </w:tc>
+        <w:tc>
+          <w:tcPr>
+            <w:tcW w:type="dxa" w:w="1680"/>
+          </w:tcPr>
+          <w:p>
+            <w:r>
+              <w:rPr>
+                <w:b/>
+              </w:rPr>
+              <w:t>Sample Count (N)</w:t>
+            </w:r>
+          </w:p>
+        </w:tc>
+        <w:tc>
+          <w:tcPr>
+            <w:tcW w:type="dxa" w:w="1680"/>
+          </w:tcPr>
+          <w:p>
+            <w:r>
+              <w:rPr>
+                <w:b/>
+              </w:rPr>
+              <w:t>Test MAE (t/ha)</w:t>
+            </w:r>
+          </w:p>
+        </w:tc>
+        <w:tc>
+          <w:tcPr>
+            <w:tcW w:type="dxa" w:w="1680"/>
+          </w:tcPr>
+          <w:p>
+            <w:r>
+              <w:rPr>
+                <w:b/>
+              </w:rPr>
+              <w:t>Test RMSE (t/ha)</w:t>
+            </w:r>
+          </w:p>
+        </w:tc>
+        <w:tc>
+          <w:tcPr>
+            <w:tcW w:type="dxa" w:w="1680"/>
+          </w:tcPr>
+          <w:p>
+            <w:r>
+              <w:rPr>
+                <w:b/>
+              </w:rPr>
+              <w:t>Test R²</w:t>
+            </w:r>
+          </w:p>
+        </w:tc>
+        <w:tc>
+          <w:tcPr>
+            <w:tcW w:type="dxa" w:w="1680"/>
+          </w:tcPr>
+          <w:p>
+            <w:r>
+              <w:rPr>
+                <w:b/>
+              </w:rPr>
+              <w:t>Stability Interpretation</w:t>
+            </w:r>
+          </w:p>
+        </w:tc>
+      </w:tr>
+      <w:tr>
+        <w:tc>
+          <w:tcPr>
+            <w:tcW w:type="dxa" w:w="1680"/>
+          </w:tcPr>
+          <w:p>
+            <w:r>
+              <w:t>2014</w:t>
+            </w:r>
+          </w:p>
+        </w:tc>
+        <w:tc>
+          <w:tcPr>
+            <w:tcW w:type="dxa" w:w="1680"/>
+          </w:tcPr>
+          <w:p>
+            <w:r>
+              <w:t>767 (90.66%)</w:t>
+            </w:r>
+          </w:p>
+        </w:tc>
+        <w:tc>
+          <w:tcPr>
+            <w:tcW w:type="dxa" w:w="1680"/>
+          </w:tcPr>
+          <w:p>
+            <w:r>
+              <w:t>0.4415</w:t>
+            </w:r>
+          </w:p>
+        </w:tc>
+        <w:tc>
+          <w:tcPr>
+            <w:tcW w:type="dxa" w:w="1680"/>
+          </w:tcPr>
+          <w:p>
+            <w:r>
+              <w:t>0.5960</w:t>
+            </w:r>
+          </w:p>
+        </w:tc>
+        <w:tc>
+          <w:tcPr>
+            <w:tcW w:type="dxa" w:w="1680"/>
+          </w:tcPr>
+          <w:p>
+            <w:r>
+              <w:t>0.4774</w:t>
+            </w:r>
+          </w:p>
+        </w:tc>
+        <w:tc>
+          <w:tcPr>
+            <w:tcW w:type="dxa" w:w="1680"/>
+          </w:tcPr>
+          <w:p>
+            <w:r>
+              <w:t>Dominates pooled test set; stable national reporting coverage across all states.</w:t>
+            </w:r>
+          </w:p>
+        </w:tc>
+      </w:tr>
+      <w:tr>
+        <w:tc>
+          <w:tcPr>
+            <w:tcW w:type="dxa" w:w="1680"/>
+          </w:tcPr>
+          <w:p>
+            <w:r>
+              <w:t>2015</w:t>
+            </w:r>
+          </w:p>
+        </w:tc>
+        <w:tc>
+          <w:tcPr>
+            <w:tcW w:type="dxa" w:w="1680"/>
+          </w:tcPr>
+          <w:p>
+            <w:r>
+              <w:t>79 (9.34%)</w:t>
+            </w:r>
+          </w:p>
+        </w:tc>
+        <w:tc>
+          <w:tcPr>
+            <w:tcW w:type="dxa" w:w="1680"/>
+          </w:tcPr>
+          <w:p>
+            <w:r>
+              <w:t>0.5290</w:t>
+            </w:r>
+          </w:p>
+        </w:tc>
+        <w:tc>
+          <w:tcPr>
+            <w:tcW w:type="dxa" w:w="1680"/>
+          </w:tcPr>
+          <w:p>
+            <w:r>
+              <w:t>0.6771</w:t>
+            </w:r>
+          </w:p>
+        </w:tc>
+        <w:tc>
+          <w:tcPr>
+            <w:tcW w:type="dxa" w:w="1680"/>
+          </w:tcPr>
+          <w:p>
+            <w:r>
+              <w:t>0.4409</w:t>
+            </w:r>
+          </w:p>
+        </w:tc>
+        <w:tc>
+          <w:tcPr>
+            <w:tcW w:type="dxa" w:w="1680"/>
+          </w:tcPr>
+          <w:p>
+            <w:r>
+              <w:t>Slightly elevated MAE driven by administrative reporting lag and eastern monsoon deficits.</w:t>
+            </w:r>
+          </w:p>
+        </w:tc>
+      </w:tr>
+    </w:tbl>
     <w:p>
       <w:r>
         <w:drawing>
@@ -1804,7 +2376,7 @@
           </w:tcPr>
           <w:p>
             <w:r>
-              <w:t>Extension 1 Raw Data</w:t>
+              <w:t>Classification Raw Data (D3)</w:t>
             </w:r>
           </w:p>
         </w:tc>

</xml_diff>

<commit_message>
docs: complete D3 provenance URL, soften 2015 robustness to hypothesis, clarify 2014 test dominance
</commit_message>
<xml_diff>
--- a/23MID0037_Lab08_Report.docx
+++ b/23MID0037_Lab08_Report.docx
@@ -346,7 +346,7 @@
           </w:tcPr>
           <w:p>
             <w:r>
-              <w:t>https://www.kaggle.com/datasets/...</w:t>
+              <w:t>https://www.kaggle.com/datasets/atharvaingle/crop-recommendation-dataset</w:t>
             </w:r>
           </w:p>
         </w:tc>
@@ -1669,7 +1669,7 @@
           </w:tcPr>
           <w:p>
             <w:r>
-              <w:t>Dominates pooled test set; stable national reporting coverage across all states.</w:t>
+              <w:t>The pooled test MAE is strongly weighted toward 2014 because 2014 contains 90.66% of test observations (767 vs 79); stable national coverage across states.</w:t>
             </w:r>
           </w:p>
         </w:tc>
@@ -1731,7 +1731,7 @@
           </w:tcPr>
           <w:p>
             <w:r>
-              <w:t>Slightly elevated MAE driven by administrative reporting lag and eastern monsoon deficits.</w:t>
+              <w:t>Slightly elevated MAE; possible contributing factors include administrative reporting lag and eastern monsoon deficits, but these causes are not established by the available predictors (lower empirical support, N=79).</w:t>
             </w:r>
           </w:p>
         </w:tc>

</xml_diff>